<commit_message>
Add LinkedIn and website links to resume header
</commit_message>
<xml_diff>
--- a/Galo_Reyes_Resume.docx
+++ b/Galo_Reyes_Resume.docx
@@ -59,7 +59,7 @@
                 <w:sz w:val="19"/>
                 <w:szCs w:val="19"/>
               </w:rPr>
-              <w:t xml:space="preserve">galojreyes@gmail.com  |  [phone]  |  San Francisco Bay Area  |  github.com/GaloReyes00  |  linkedin.com/in/[you]  |  [your-website-url]</w:t>
+              <w:t>galojreyes@gmail.com  |  [phone]  |  San Francisco Bay Area  |  github.com/GaloReyes00  |  linkedin.com/in/galo-reyes-2275a32a3  |  galoreyes00.github.io</w:t>
             </w:r>
           </w:p>
         </w:tc>
@@ -606,7 +606,7 @@
           <w:sz w:val="22"/>
           <w:szCs w:val="22"/>
         </w:rPr>
-        <w:t xml:space="preserve">Redwood Smiles — Pediatric Dentistry &amp; Orthodontics</w:t>
+        <w:t>Image Orthodontics</w:t>
       </w:r>
       <w:r>
         <w:rPr>
@@ -617,25 +617,26 @@
           <w:sz w:val="21"/>
           <w:szCs w:val="21"/>
         </w:rPr>
-        <w:t xml:space="preserve">	[Role]  |  [Dates]</w:t>
-      </w:r>
-    </w:p>
-    <w:p>
-      <w:pPr>
-        <w:pStyle w:val="ListParagraph"/>
-        <w:numPr>
-          <w:ilvl w:val="0"/>
-          <w:numId w:val="2"/>
-        </w:numPr>
-        <w:spacing w:after="26"/>
-      </w:pPr>
-      <w:r>
-        <w:rPr>
-          <w:rFonts w:ascii="Calibri" w:cs="Calibri" w:eastAsia="Calibri" w:hAnsi="Calibri"/>
-          <w:sz w:val="21"/>
-          <w:szCs w:val="21"/>
-        </w:rPr>
-        <w:t xml:space="preserve">Designed and pitched a patient self-scheduling web demo to the practice owner: online booking with insurance intake, an AI assistant for common questions, QR-code booking, and an SMS fallback for dropped chats.</w:t>
+        <w:tab/>
+        <w:t>Dental Assistant  |  2024 - Present</w:t>
+      </w:r>
+    </w:p>
+    <w:p>
+      <w:pPr>
+        <w:pStyle w:val="ListParagraph"/>
+        <w:numPr>
+          <w:ilvl w:val="0"/>
+          <w:numId w:val="2"/>
+        </w:numPr>
+        <w:spacing w:after="26"/>
+      </w:pPr>
+      <w:r>
+        <w:rPr>
+          <w:rFonts w:ascii="Calibri" w:cs="Calibri" w:eastAsia="Calibri" w:hAnsi="Calibri"/>
+          <w:sz w:val="21"/>
+          <w:szCs w:val="21"/>
+        </w:rPr>
+        <w:t>Designed and built a patient self-scheduling web demo based on workflow gaps observed on the job: online booking with insurance intake, an AI assistant for common questions, QR-code booking, and an SMS fallback for dropped chats.</w:t>
       </w:r>
     </w:p>
     <w:p>

</xml_diff>

<commit_message>
Final resume: all placeholders filled
</commit_message>
<xml_diff>
--- a/Galo_Reyes_Resume.docx
+++ b/Galo_Reyes_Resume.docx
@@ -59,7 +59,7 @@
                 <w:sz w:val="19"/>
                 <w:szCs w:val="19"/>
               </w:rPr>
-              <w:t>galojreyes@gmail.com  |  [phone]  |  San Francisco Bay Area  |  github.com/GaloReyes00  |  linkedin.com/in/galo-reyes-2275a32a3  |  galoreyes00.github.io</w:t>
+              <w:t>galojreyes@gmail.com  |  (650) 293-7812  |  San Francisco Bay Area  |  github.com/GaloReyes00  |  linkedin.com/in/galo-reyes-2275a32a3  |  galoreyes00.github.io</w:t>
             </w:r>
           </w:p>
         </w:tc>
@@ -118,7 +118,7 @@
           <w:sz w:val="22"/>
           <w:szCs w:val="22"/>
         </w:rPr>
-        <w:t xml:space="preserve">San Francisco State University</w:t>
+        <w:t>San Francisco State University</w:t>
       </w:r>
       <w:r>
         <w:rPr>
@@ -129,7 +129,8 @@
           <w:sz w:val="21"/>
           <w:szCs w:val="21"/>
         </w:rPr>
-        <w:t xml:space="preserve">	Expected Grad: [Month Year]</w:t>
+        <w:tab/>
+        <w:t>Expected Grad: May 2027</w:t>
       </w:r>
     </w:p>
     <w:p>
@@ -145,25 +146,25 @@
           <w:sz w:val="21"/>
           <w:szCs w:val="21"/>
         </w:rPr>
-        <w:t xml:space="preserve">B.S. Computer Science  |  GPA: [X.XX]</w:t>
-      </w:r>
-    </w:p>
-    <w:p>
-      <w:pPr>
-        <w:pStyle w:val="ListParagraph"/>
-        <w:numPr>
-          <w:ilvl w:val="0"/>
-          <w:numId w:val="2"/>
-        </w:numPr>
-        <w:spacing w:after="26"/>
-      </w:pPr>
-      <w:r>
-        <w:rPr>
-          <w:rFonts w:ascii="Calibri" w:cs="Calibri" w:eastAsia="Calibri" w:hAnsi="Calibri"/>
-          <w:sz w:val="21"/>
-          <w:szCs w:val="21"/>
-        </w:rPr>
-        <w:t xml:space="preserve">Relevant coursework: Operating Systems, Data Structures, Algorithms, Database Systems, [add others]</w:t>
+        <w:t>B.S. Computer Science  |  GPA: 3.35</w:t>
+      </w:r>
+    </w:p>
+    <w:p>
+      <w:pPr>
+        <w:pStyle w:val="ListParagraph"/>
+        <w:numPr>
+          <w:ilvl w:val="0"/>
+          <w:numId w:val="2"/>
+        </w:numPr>
+        <w:spacing w:after="26"/>
+      </w:pPr>
+      <w:r>
+        <w:rPr>
+          <w:rFonts w:ascii="Calibri" w:cs="Calibri" w:eastAsia="Calibri" w:hAnsi="Calibri"/>
+          <w:sz w:val="21"/>
+          <w:szCs w:val="21"/>
+        </w:rPr>
+        <w:t>Relevant coursework: Operating Systems, Data Structures, Algorithms, Database Systems, Software Engineering</w:t>
       </w:r>
     </w:p>
     <w:p>
@@ -432,7 +433,7 @@
           <w:sz w:val="22"/>
           <w:szCs w:val="22"/>
         </w:rPr>
-        <w:t xml:space="preserve">Personal Portfolio Website + [MySQL Project]</w:t>
+        <w:t>SwampMeet Marketplace (Team) + Portfolio Website</w:t>
       </w:r>
       <w:r>
         <w:rPr>
@@ -443,7 +444,25 @@
           <w:sz w:val="21"/>
           <w:szCs w:val="21"/>
         </w:rPr>
-        <w:t xml:space="preserve">	HTML/CSS/JS, MySQL  |  2026</w:t>
+        <w:tab/>
+        <w:t>HTML/CSS/JS, MySQL  |  2026</w:t>
+      </w:r>
+    </w:p>
+    <w:p>
+      <w:pPr>
+        <w:pStyle w:val="ListParagraph"/>
+        <w:numPr>
+          <w:ilvl w:val="0"/>
+          <w:numId w:val="2"/>
+        </w:numPr>
+        <w:spacing w:after="26"/>
+      </w:pPr>
+      <w:r>
+        <w:rPr>
+          <w:rFonts w:ascii="Calibri" w:hAnsi="Calibri"/>
+          <w:sz w:val="21"/>
+        </w:rPr>
+        <w:t>Built SwampMeet with a CSC 648 team: a marketplace web app for SFSU students with @sfsu.edu-only accounts, course-code textbook matching, and campus-safe meetup zones — live at swampmeet.vercel.app.</w:t>
       </w:r>
     </w:p>
     <w:p>
@@ -655,53 +674,6 @@
           <w:szCs w:val="21"/>
         </w:rPr>
         <w:t xml:space="preserve">Proposed recall/reminder workflow improvements (6-month recall texts with self-booking links) to reduce phone-tag and no-shows for a practice running CareStack and Cloud 9.</w:t>
-      </w:r>
-    </w:p>
-    <w:p>
-      <w:pPr>
-        <w:tabs>
-          <w:tab w:val="right" w:pos="10080"/>
-        </w:tabs>
-        <w:spacing w:after="16" w:before="60"/>
-      </w:pPr>
-      <w:r>
-        <w:rPr>
-          <w:rFonts w:ascii="Calibri" w:cs="Calibri" w:eastAsia="Calibri" w:hAnsi="Calibri"/>
-          <w:b/>
-          <w:bCs/>
-          <w:sz w:val="22"/>
-          <w:szCs w:val="22"/>
-        </w:rPr>
-        <w:t xml:space="preserve">Independent Vendor — [Swap Meet Name]</w:t>
-      </w:r>
-      <w:r>
-        <w:rPr>
-          <w:rFonts w:ascii="Calibri" w:cs="Calibri" w:eastAsia="Calibri" w:hAnsi="Calibri"/>
-          <w:i/>
-          <w:iCs/>
-          <w:color w:val="555555"/>
-          <w:sz w:val="21"/>
-          <w:szCs w:val="21"/>
-        </w:rPr>
-        <w:t xml:space="preserve">	[Dates]</w:t>
-      </w:r>
-    </w:p>
-    <w:p>
-      <w:pPr>
-        <w:pStyle w:val="ListParagraph"/>
-        <w:numPr>
-          <w:ilvl w:val="0"/>
-          <w:numId w:val="2"/>
-        </w:numPr>
-        <w:spacing w:after="26"/>
-      </w:pPr>
-      <w:r>
-        <w:rPr>
-          <w:rFonts w:ascii="Calibri" w:cs="Calibri" w:eastAsia="Calibri" w:hAnsi="Calibri"/>
-          <w:sz w:val="21"/>
-          <w:szCs w:val="21"/>
-        </w:rPr>
-        <w:t xml:space="preserve">[Run a resale booth: sourcing, pricing, inventory, and direct customer sales — fill in specifics]</w:t>
       </w:r>
     </w:p>
     <w:p>

</xml_diff>